<commit_message>
Build reproducible fail-closed policy pipeline
</commit_message>
<xml_diff>
--- a/docs/CISPolicyCreator_Fail_Closed_Mapping_Policy.docx
+++ b/docs/CISPolicyCreator_Fail_Closed_Mapping_Policy.docx
@@ -1,918 +1,315 @@
 
 <file path=word/document.xml><?xml version="1.0" encoding="utf-8"?>
-<w:document xmlns:wpc="http://schemas.microsoft.com/office/word/2010/wordprocessingCanvas" xmlns:mo="http://schemas.microsoft.com/office/mac/office/2008/main" xmlns:mc="http://schemas.openxmlformats.org/markup-compatibility/2006" xmlns:mv="urn:schemas-microsoft-com:mac:vml" xmlns:o="urn:schemas-microsoft-com:office:office" xmlns:r="http://schemas.openxmlformats.org/officeDocument/2006/relationships" xmlns:m="http://schemas.openxmlformats.org/officeDocument/2006/math" xmlns:v="urn:schemas-microsoft-com:vml" xmlns:wp14="http://schemas.microsoft.com/office/word/2010/wordprocessingDrawing" xmlns:wp="http://schemas.openxmlformats.org/drawingml/2006/wordprocessingDrawing" xmlns:w10="urn:schemas-microsoft-com:office:word" xmlns:w="http://schemas.openxmlformats.org/wordprocessingml/2006/main" xmlns:w14="http://schemas.microsoft.com/office/word/2010/wordml" xmlns:wpg="http://schemas.microsoft.com/office/word/2010/wordprocessingGroup" xmlns:wpi="http://schemas.microsoft.com/office/word/2010/wordprocessingInk" xmlns:wne="http://schemas.microsoft.com/office/word/2006/wordml" xmlns:wps="http://schemas.microsoft.com/office/word/2010/wordprocessingShape" mc:Ignorable="w14 wp14">
+<w:document xmlns:w="http://schemas.openxmlformats.org/wordprocessingml/2006/main">
   <w:body>
-    <w:p>
-      <w:pPr>
-        <w:jc w:val="center"/>
-      </w:pPr>
-      <w:r>
-        <w:rPr>
-          <w:b/>
-          <w:sz w:val="48"/>
-        </w:rPr>
-        <w:t>CISPolicyCreator</w:t>
-      </w:r>
-    </w:p>
-    <w:p>
-      <w:pPr>
-        <w:jc w:val="center"/>
-      </w:pPr>
-      <w:r>
-        <w:rPr>
-          <w:b/>
-          <w:sz w:val="36"/>
-        </w:rPr>
-        <w:t>Fail-Closed Mapping and Validation Policy</w:t>
-      </w:r>
-    </w:p>
-    <w:p>
-      <w:pPr>
-        <w:jc w:val="center"/>
-      </w:pPr>
-      <w:r>
-        <w:rPr>
-          <w:i/>
-          <w:sz w:val="21"/>
-        </w:rPr>
-        <w:t>Design standard for converting supported CIS Microsoft Intune benchmarks into deployable Intune policy packs</w:t>
-      </w:r>
-    </w:p>
-    <w:tbl>
-      <w:tblPr>
-        <w:tblStyle w:val="TableGrid"/>
-        <w:tblW w:type="auto" w:w="0"/>
-        <w:tblLook w:firstColumn="1" w:firstRow="1" w:lastColumn="0" w:lastRow="0" w:noHBand="0" w:noVBand="1" w:val="04A0"/>
-      </w:tblPr>
-      <w:tblGrid>
-        <w:gridCol w:w="5040"/>
-        <w:gridCol w:w="5040"/>
-      </w:tblGrid>
-      <w:tr>
-        <w:tc>
-          <w:tcPr>
-            <w:tcW w:type="dxa" w:w="5040"/>
-          </w:tcPr>
-          <w:p>
-            <w:r>
-              <w:rPr>
-                <w:b/>
-              </w:rPr>
-              <w:t>Document status</w:t>
-            </w:r>
-          </w:p>
-        </w:tc>
-        <w:tc>
-          <w:tcPr>
-            <w:tcW w:type="dxa" w:w="5040"/>
-          </w:tcPr>
-          <w:p>
-            <w:r>
-              <w:t>Project design standard</w:t>
-            </w:r>
-          </w:p>
-        </w:tc>
-      </w:tr>
-      <w:tr>
-        <w:tc>
-          <w:tcPr>
-            <w:tcW w:type="dxa" w:w="5040"/>
-          </w:tcPr>
-          <w:p>
-            <w:r>
-              <w:rPr>
-                <w:b/>
-              </w:rPr>
-              <w:t>Applies to</w:t>
-            </w:r>
-          </w:p>
-        </w:tc>
-        <w:tc>
-          <w:tcPr>
-            <w:tcW w:type="dxa" w:w="5040"/>
-          </w:tcPr>
-          <w:p>
-            <w:r>
-              <w:t>CISPolicyCreator repository and generated benchmark packs</w:t>
-            </w:r>
-          </w:p>
-        </w:tc>
-      </w:tr>
-      <w:tr>
-        <w:tc>
-          <w:tcPr>
-            <w:tcW w:type="dxa" w:w="5040"/>
-          </w:tcPr>
-          <w:p>
-            <w:r>
-              <w:rPr>
-                <w:b/>
-              </w:rPr>
-              <w:t>Primary rule</w:t>
-            </w:r>
-          </w:p>
-        </w:tc>
-        <w:tc>
-          <w:tcPr>
-            <w:tcW w:type="dxa" w:w="5040"/>
-          </w:tcPr>
-          <w:p>
-            <w:r>
-              <w:t>Never generate a deployable setting when the mapping is uncertain</w:t>
-            </w:r>
-          </w:p>
-        </w:tc>
-      </w:tr>
-      <w:tr>
-        <w:tc>
-          <w:tcPr>
-            <w:tcW w:type="dxa" w:w="5040"/>
-          </w:tcPr>
-          <w:p>
-            <w:r>
-              <w:rPr>
-                <w:b/>
-              </w:rPr>
-              <w:t>Default deployment state</w:t>
-            </w:r>
-          </w:p>
-        </w:tc>
-        <w:tc>
-          <w:tcPr>
-            <w:tcW w:type="dxa" w:w="5040"/>
-          </w:tcPr>
-          <w:p>
-            <w:r>
-              <w:t>Unassigned; explicit operator action required</w:t>
-            </w:r>
-          </w:p>
-        </w:tc>
-      </w:tr>
-    </w:tbl>
     <w:p>
       <w:pPr>
         <w:pStyle w:val="Heading1"/>
       </w:pPr>
       <w:r>
-        <w:t>1. Purpose</w:t>
+        <w:t xml:space="preserve">Fail-closed mapping and validation policy</w:t>
+      </w:r>
+    </w:p>
+    <w:p/>
+    <w:p>
+      <w:pPr>
+        <w:pStyle w:val="Heading2"/>
+      </w:pPr>
+      <w:r>
+        <w:t xml:space="preserve">Purpose</w:t>
+      </w:r>
+    </w:p>
+    <w:p/>
+    <w:p>
+      <w:r>
+        <w:t xml:space="preserve">CISPolicyCreator converts CIS Benchmarks authored specifically for Microsoft Intune into Microsoft Intune policy objects. When any source identity, mapping, value, administrator decision, API representation, or cross-file reference is uncertain, the affected implementation is not emitted.</w:t>
+      </w:r>
+    </w:p>
+    <w:p/>
+    <w:p>
+      <w:r>
+        <w:t xml:space="preserve">The project optimizes for accuracy and auditability, not maximum automation.</w:t>
+      </w:r>
+    </w:p>
+    <w:p/>
+    <w:p>
+      <w:pPr>
+        <w:pStyle w:val="Heading2"/>
+      </w:pPr>
+      <w:r>
+        <w:t xml:space="preserve">Independent classification axes</w:t>
+      </w:r>
+    </w:p>
+    <w:p/>
+    <w:p>
+      <w:r>
+        <w:t xml:space="preserve">`cisAssessmentMethod` records the benchmark's assessment classification:</w:t>
+      </w:r>
+    </w:p>
+    <w:p/>
+    <w:p>
+      <w:r>
+        <w:t xml:space="preserve">• `Manual`</w:t>
       </w:r>
     </w:p>
     <w:p>
       <w:r>
-        <w:t>CISPolicyCreator translates CIS Benchmarks that are explicitly authored for Microsoft Intune into Microsoft Intune policy objects. This document defines the project's fail-closed behavior: when a recommendation cannot be mapped with high confidence to a real Intune policy object, setting, API field, or supported configuration mechanism, the tool must stop short of deployment and clearly mark the recommendation for human review.</w:t>
+        <w:t xml:space="preserve">• `Automated`</w:t>
+      </w:r>
+    </w:p>
+    <w:p/>
+    <w:p>
+      <w:r>
+        <w:t xml:space="preserve">`mappingStatus` records the state of the Intune mapping:</w:t>
+      </w:r>
+    </w:p>
+    <w:p/>
+    <w:p>
+      <w:r>
+        <w:t xml:space="preserve">• `mapped`: a deterministic, reviewed implementation exists;</w:t>
       </w:r>
     </w:p>
     <w:p>
       <w:r>
-        <w:t>The goal is accuracy and auditability, not maximum automation. A missing policy is safer than a confidently wrong policy.</w:t>
-      </w:r>
-    </w:p>
-    <w:p>
-      <w:pPr>
-        <w:pStyle w:val="Heading1"/>
-      </w:pPr>
-      <w:r>
-        <w:t>2. Supported Scope</w:t>
+        <w:t xml:space="preserve">• `unresolved`: a possible implementation has not been proven exactly;</w:t>
       </w:r>
     </w:p>
     <w:p>
       <w:r>
-        <w:t>The project supports only CIS Benchmarks that are specifically written for Microsoft Intune. Generic platform benchmarks may contain settings that can be implemented with Intune, but they are out of scope unless a separate, reviewed mapping project explicitly adds support.</w:t>
-      </w:r>
-    </w:p>
-    <w:p>
-      <w:pPr>
-        <w:pStyle w:val="Heading1"/>
-      </w:pPr>
-      <w:r>
-        <w:t>3. Mapping States</w:t>
-      </w:r>
-    </w:p>
-    <w:tbl>
-      <w:tblPr>
-        <w:tblStyle w:val="TableGrid"/>
-        <w:tblW w:type="auto" w:w="0"/>
-        <w:tblLook w:firstColumn="1" w:firstRow="1" w:lastColumn="0" w:lastRow="0" w:noHBand="0" w:noVBand="1" w:val="04A0"/>
-      </w:tblPr>
-      <w:tblGrid>
-        <w:gridCol w:w="2520"/>
-        <w:gridCol w:w="2520"/>
-        <w:gridCol w:w="2520"/>
-        <w:gridCol w:w="2520"/>
-      </w:tblGrid>
-      <w:tr>
-        <w:tc>
-          <w:tcPr>
-            <w:tcW w:type="dxa" w:w="2520"/>
-          </w:tcPr>
-          <w:p>
-            <w:r>
-              <w:rPr>
-                <w:b/>
-              </w:rPr>
-              <w:t>State</w:t>
-            </w:r>
-          </w:p>
-        </w:tc>
-        <w:tc>
-          <w:tcPr>
-            <w:tcW w:type="dxa" w:w="2520"/>
-          </w:tcPr>
-          <w:p>
-            <w:r>
-              <w:t>Meaning</w:t>
-            </w:r>
-          </w:p>
-        </w:tc>
-        <w:tc>
-          <w:tcPr>
-            <w:tcW w:type="dxa" w:w="2520"/>
-          </w:tcPr>
-          <w:p>
-            <w:r>
-              <w:t>Deployable</w:t>
-            </w:r>
-          </w:p>
-        </w:tc>
-        <w:tc>
-          <w:tcPr>
-            <w:tcW w:type="dxa" w:w="2520"/>
-          </w:tcPr>
-          <w:p>
-            <w:r>
-              <w:t>Required behavior</w:t>
-            </w:r>
-          </w:p>
-        </w:tc>
-      </w:tr>
-      <w:tr>
-        <w:tc>
-          <w:tcPr>
-            <w:tcW w:type="dxa" w:w="2520"/>
-          </w:tcPr>
-          <w:p>
-            <w:r>
-              <w:rPr>
-                <w:b/>
-              </w:rPr>
-              <w:t>mapped</w:t>
-            </w:r>
-          </w:p>
-        </w:tc>
-        <w:tc>
-          <w:tcPr>
-            <w:tcW w:type="dxa" w:w="2520"/>
-          </w:tcPr>
-          <w:p>
-            <w:r>
-              <w:t>The recommendation is confidently mapped to a supported Intune configuration mechanism and the target value is validated.</w:t>
-            </w:r>
-          </w:p>
-        </w:tc>
-        <w:tc>
-          <w:tcPr>
-            <w:tcW w:type="dxa" w:w="2520"/>
-          </w:tcPr>
-          <w:p>
-            <w:r>
-              <w:t>Yes</w:t>
-            </w:r>
-          </w:p>
-        </w:tc>
-        <w:tc>
-          <w:tcPr>
-            <w:tcW w:type="dxa" w:w="2520"/>
-          </w:tcPr>
-          <w:p>
-            <w:r>
-              <w:t>Generate the policy payload and include it in DryRun/import.</w:t>
-            </w:r>
-          </w:p>
-        </w:tc>
-      </w:tr>
-      <w:tr>
-        <w:tc>
-          <w:tcPr>
-            <w:tcW w:type="dxa" w:w="2520"/>
-          </w:tcPr>
-          <w:p>
-            <w:r>
-              <w:rPr>
-                <w:b/>
-              </w:rPr>
-              <w:t>manual</w:t>
-            </w:r>
-          </w:p>
-        </w:tc>
-        <w:tc>
-          <w:tcPr>
-            <w:tcW w:type="dxa" w:w="2520"/>
-          </w:tcPr>
-          <w:p>
-            <w:r>
-              <w:t>CIS explicitly requires administrator action or the setting is not safely automatable through the supported Intune APIs.</w:t>
-            </w:r>
-          </w:p>
-        </w:tc>
-        <w:tc>
-          <w:tcPr>
-            <w:tcW w:type="dxa" w:w="2520"/>
-          </w:tcPr>
-          <w:p>
-            <w:r>
-              <w:t>No</w:t>
-            </w:r>
-          </w:p>
-        </w:tc>
-        <w:tc>
-          <w:tcPr>
-            <w:tcW w:type="dxa" w:w="2520"/>
-          </w:tcPr>
-          <w:p>
-            <w:r>
-              <w:t>Document the required action and exclude it from generated policy payloads.</w:t>
-            </w:r>
-          </w:p>
-        </w:tc>
-      </w:tr>
-      <w:tr>
-        <w:tc>
-          <w:tcPr>
-            <w:tcW w:type="dxa" w:w="2520"/>
-          </w:tcPr>
-          <w:p>
-            <w:r>
-              <w:rPr>
-                <w:b/>
-              </w:rPr>
-              <w:t>unresolved</w:t>
-            </w:r>
-          </w:p>
-        </w:tc>
-        <w:tc>
-          <w:tcPr>
-            <w:tcW w:type="dxa" w:w="2520"/>
-          </w:tcPr>
-          <w:p>
-            <w:r>
-              <w:t>The recommendation appears automatable, but the Intune object, setting definition, value, API representation, or platform behavior cannot be resolved with sufficient confidence.</w:t>
-            </w:r>
-          </w:p>
-        </w:tc>
-        <w:tc>
-          <w:tcPr>
-            <w:tcW w:type="dxa" w:w="2520"/>
-          </w:tcPr>
-          <w:p>
-            <w:r>
-              <w:t>No</w:t>
-            </w:r>
-          </w:p>
-        </w:tc>
-        <w:tc>
-          <w:tcPr>
-            <w:tcW w:type="dxa" w:w="2520"/>
-          </w:tcPr>
-          <w:p>
-            <w:r>
-              <w:t>Fail closed. Record why resolution failed and require review.</w:t>
-            </w:r>
-          </w:p>
-        </w:tc>
-      </w:tr>
-      <w:tr>
-        <w:tc>
-          <w:tcPr>
-            <w:tcW w:type="dxa" w:w="2520"/>
-          </w:tcPr>
-          <w:p>
-            <w:r>
-              <w:rPr>
-                <w:b/>
-              </w:rPr>
-              <w:t>not-applicable</w:t>
-            </w:r>
-          </w:p>
-        </w:tc>
-        <w:tc>
-          <w:tcPr>
-            <w:tcW w:type="dxa" w:w="2520"/>
-          </w:tcPr>
-          <w:p>
-            <w:r>
-              <w:t>The recommendation does not apply to the selected platform/profile or is superseded by benchmark-specific applicability rules.</w:t>
-            </w:r>
-          </w:p>
-        </w:tc>
-        <w:tc>
-          <w:tcPr>
-            <w:tcW w:type="dxa" w:w="2520"/>
-          </w:tcPr>
-          <w:p>
-            <w:r>
-              <w:t>No</w:t>
-            </w:r>
-          </w:p>
-        </w:tc>
-        <w:tc>
-          <w:tcPr>
-            <w:tcW w:type="dxa" w:w="2520"/>
-          </w:tcPr>
-          <w:p>
-            <w:r>
-              <w:t>Exclude from deployment and record the applicability decision.</w:t>
-            </w:r>
-          </w:p>
-        </w:tc>
-      </w:tr>
-    </w:tbl>
-    <w:p>
-      <w:pPr>
-        <w:pStyle w:val="Heading1"/>
-      </w:pPr>
-      <w:r>
-        <w:t>4. Fail-Closed Decision Rules</w:t>
-      </w:r>
-    </w:p>
-    <w:p>
-      <w:pPr>
-        <w:pStyle w:val="ListBullet"/>
-      </w:pPr>
-      <w:r>
-        <w:t>A recommendation is deployable only when its source recommendation, profile applicability, Intune configuration mechanism, target setting, and required value are all known.</w:t>
-      </w:r>
-    </w:p>
-    <w:p>
-      <w:pPr>
-        <w:pStyle w:val="ListBullet"/>
-      </w:pPr>
-      <w:r>
-        <w:t>The tool must never guess a settingDefinitionId, choice ID, OMA-URI, plist key, Graph property, value encoding, or policy type.</w:t>
-      </w:r>
-    </w:p>
-    <w:p>
-      <w:pPr>
-        <w:pStyle w:val="ListBullet"/>
-      </w:pPr>
-      <w:r>
-        <w:t>If the benchmark gives a user-interface path but the corresponding Graph representation cannot be resolved, the recommendation is unresolved until the mapping is validated.</w:t>
-      </w:r>
-    </w:p>
-    <w:p>
-      <w:pPr>
-        <w:pStyle w:val="ListBullet"/>
-      </w:pPr>
-      <w:r>
-        <w:t>If multiple Intune settings appear to match one recommendation and the tool cannot uniquely identify the intended setting, the recommendation is unresolved.</w:t>
-      </w:r>
-    </w:p>
-    <w:p>
-      <w:pPr>
-        <w:pStyle w:val="ListBullet"/>
-      </w:pPr>
-      <w:r>
-        <w:t>If Microsoft changes or removes a setting and the current tenant no longer exposes the expected API definition, the recommendation is unresolved rather than silently substituted.</w:t>
-      </w:r>
-    </w:p>
-    <w:p>
-      <w:pPr>
-        <w:pStyle w:val="ListBullet"/>
-      </w:pPr>
-      <w:r>
-        <w:t>A recommendation marked Manual by CIS remains manual unless the project contains a separately reviewed implementation that is demonstrably equivalent and is explicitly documented as such.</w:t>
-      </w:r>
-    </w:p>
-    <w:p>
-      <w:pPr>
-        <w:pStyle w:val="ListBullet"/>
-      </w:pPr>
-      <w:r>
-        <w:t>Generated policies must never be assigned automatically. Assignment is always a separate operator decision.</w:t>
-      </w:r>
-    </w:p>
-    <w:p>
-      <w:pPr>
-        <w:pStyle w:val="Heading1"/>
-      </w:pPr>
-      <w:r>
-        <w:t>5. Required Validation Pipeline</w:t>
-      </w:r>
-    </w:p>
-    <w:p>
-      <w:pPr>
-        <w:pStyle w:val="ListNumber"/>
-      </w:pPr>
-      <w:r>
-        <w:rPr>
-          <w:b/>
-        </w:rPr>
-        <w:t xml:space="preserve">Parse: </w:t>
-      </w:r>
-      <w:r>
-        <w:t>Extract recommendation ID, title, profile, applicability, remediation path, required value, and relevant implementation metadata from the supported CIS Intune benchmark.</w:t>
-      </w:r>
-    </w:p>
-    <w:p>
-      <w:pPr>
-        <w:pStyle w:val="ListNumber"/>
-      </w:pPr>
-      <w:r>
-        <w:rPr>
-          <w:b/>
-        </w:rPr>
-        <w:t xml:space="preserve">Classify: </w:t>
-      </w:r>
-      <w:r>
-        <w:t>Determine the Intune object type, for example Settings Catalog, compliance policy, platform configuration policy, Endpoint Security policy, declarative device management setting, or another supported Intune object.</w:t>
-      </w:r>
-    </w:p>
-    <w:p>
-      <w:pPr>
-        <w:pStyle w:val="ListNumber"/>
-      </w:pPr>
-      <w:r>
-        <w:rPr>
-          <w:b/>
-        </w:rPr>
-        <w:t xml:space="preserve">Resolve: </w:t>
-      </w:r>
-      <w:r>
-        <w:t>Resolve the live Microsoft Graph/Intune representation. Runtime resolution is preferred for settings whose internal IDs may change.</w:t>
-      </w:r>
-    </w:p>
-    <w:p>
-      <w:pPr>
-        <w:pStyle w:val="ListNumber"/>
-      </w:pPr>
-      <w:r>
-        <w:rPr>
-          <w:b/>
-        </w:rPr>
-        <w:t xml:space="preserve">Validate value: </w:t>
-      </w:r>
-      <w:r>
-        <w:t>Verify the configured value or option against the live definition and benchmark requirement. Do not infer option IDs from labels alone when the API exposes authoritative choices.</w:t>
-      </w:r>
-    </w:p>
-    <w:p>
-      <w:pPr>
-        <w:pStyle w:val="ListNumber"/>
-      </w:pPr>
-      <w:r>
-        <w:rPr>
-          <w:b/>
-        </w:rPr>
-        <w:t xml:space="preserve">Build payload: </w:t>
-      </w:r>
-      <w:r>
-        <w:t>Construct a clean create payload containing only writable properties. Remove response-only metadata and OData navigation annotations.</w:t>
-      </w:r>
-    </w:p>
-    <w:p>
-      <w:pPr>
-        <w:pStyle w:val="ListNumber"/>
-      </w:pPr>
-      <w:r>
-        <w:rPr>
-          <w:b/>
-        </w:rPr>
-        <w:t xml:space="preserve">Dry run: </w:t>
-      </w:r>
-      <w:r>
-        <w:t>Build the exact payload without creating or assigning the policy. Any unresolved mapping blocks the affected recommendation from deployment.</w:t>
-      </w:r>
-    </w:p>
-    <w:p>
-      <w:pPr>
-        <w:pStyle w:val="ListNumber"/>
-      </w:pPr>
-      <w:r>
-        <w:rPr>
-          <w:b/>
-        </w:rPr>
-        <w:t xml:space="preserve">Create unassigned: </w:t>
-      </w:r>
-      <w:r>
-        <w:t>Create the policy only after successful validation. No assignments are created by the baseline importer.</w:t>
-      </w:r>
-    </w:p>
-    <w:p>
-      <w:pPr>
-        <w:pStyle w:val="ListNumber"/>
-      </w:pPr>
-      <w:r>
-        <w:rPr>
-          <w:b/>
-        </w:rPr>
-        <w:t xml:space="preserve">Validate in tenant: </w:t>
-      </w:r>
-      <w:r>
-        <w:t>Use Intune reporting and, where available, the corresponding CIS/assessment tooling to confirm that the imported policy behaves as intended.</w:t>
-      </w:r>
-    </w:p>
-    <w:p>
-      <w:pPr>
-        <w:pStyle w:val="Heading1"/>
-      </w:pPr>
-      <w:r>
-        <w:t>6. Runtime Safety Controls</w:t>
-      </w:r>
-    </w:p>
-    <w:p>
-      <w:pPr>
-        <w:pStyle w:val="ListBullet"/>
-      </w:pPr>
-      <w:r>
-        <w:t>Tenant verification before write operations, including tenant ID and organization display name.</w:t>
-      </w:r>
-    </w:p>
-    <w:p>
-      <w:pPr>
-        <w:pStyle w:val="ListBullet"/>
-      </w:pPr>
-      <w:r>
-        <w:t>Optional explicit -TenantId pinning for test and production workflows.</w:t>
-      </w:r>
-    </w:p>
-    <w:p>
-      <w:pPr>
-        <w:pStyle w:val="ListBullet"/>
-      </w:pPr>
-      <w:r>
-        <w:t>A -ProbeOnly mode to confirm Graph write capability with a temporary object that is immediately deleted.</w:t>
-      </w:r>
-    </w:p>
-    <w:p>
-      <w:pPr>
-        <w:pStyle w:val="ListBullet"/>
-      </w:pPr>
-      <w:r>
-        <w:t>A -DryRun mode that resolves settings and builds final payloads without creating policies.</w:t>
-      </w:r>
-    </w:p>
-    <w:p>
-      <w:pPr>
-        <w:pStyle w:val="ListBullet"/>
-      </w:pPr>
-      <w:r>
-        <w:t>Existing-policy detection to avoid accidental duplicate creation.</w:t>
-      </w:r>
-    </w:p>
-    <w:p>
-      <w:pPr>
-        <w:pStyle w:val="ListBullet"/>
-      </w:pPr>
-      <w:r>
-        <w:t>Detailed Graph error capture, including the service response body where possible.</w:t>
-      </w:r>
-    </w:p>
-    <w:p>
-      <w:pPr>
-        <w:pStyle w:val="ListBullet"/>
-      </w:pPr>
-      <w:r>
-        <w:t>No automatic assignments, no automatic group creation, and no implicit production deployment.</w:t>
-      </w:r>
-    </w:p>
-    <w:p>
-      <w:pPr>
-        <w:pStyle w:val="ListBullet"/>
-      </w:pPr>
-      <w:r>
-        <w:t>Per-recommendation status logging so every recommendation can be traced to mapped, manual, unresolved, or not-applicable state.</w:t>
-      </w:r>
-    </w:p>
-    <w:p>
-      <w:pPr>
-        <w:pStyle w:val="Heading1"/>
-      </w:pPr>
-      <w:r>
-        <w:t>7. Audit Output Requirements</w:t>
+        <w:t xml:space="preserve">• `requires-input`: the implementation path is known but an organizational value requires explicit administrator choice;</w:t>
       </w:r>
     </w:p>
     <w:p>
       <w:r>
-        <w:t>Every generated benchmark pack should include an audit mapping that allows a reviewer to answer, for each recommendation:</w:t>
-      </w:r>
-    </w:p>
-    <w:p>
-      <w:pPr>
-        <w:pStyle w:val="ListBullet"/>
-      </w:pPr>
-      <w:r>
-        <w:t>Which CIS recommendation and profile does this represent?</w:t>
-      </w:r>
-    </w:p>
-    <w:p>
-      <w:pPr>
-        <w:pStyle w:val="ListBullet"/>
-      </w:pPr>
-      <w:r>
-        <w:t>Which Intune policy contains it?</w:t>
-      </w:r>
-    </w:p>
-    <w:p>
-      <w:pPr>
-        <w:pStyle w:val="ListBullet"/>
-      </w:pPr>
-      <w:r>
-        <w:t>Which Microsoft Graph object and setting definition are used?</w:t>
-      </w:r>
-    </w:p>
-    <w:p>
-      <w:pPr>
-        <w:pStyle w:val="ListBullet"/>
-      </w:pPr>
-      <w:r>
-        <w:t>What value is being configured?</w:t>
-      </w:r>
-    </w:p>
-    <w:p>
-      <w:pPr>
-        <w:pStyle w:val="ListBullet"/>
-      </w:pPr>
-      <w:r>
-        <w:t>Was the value resolved dynamically or statically?</w:t>
-      </w:r>
-    </w:p>
-    <w:p>
-      <w:pPr>
-        <w:pStyle w:val="ListBullet"/>
-      </w:pPr>
-      <w:r>
-        <w:t>What is the mapping state and, if not mapped, why?</w:t>
-      </w:r>
-    </w:p>
-    <w:p>
-      <w:pPr>
-        <w:pStyle w:val="ListBullet"/>
-      </w:pPr>
-      <w:r>
-        <w:t>Was the recommendation created, skipped, unresolved, or left manual during the most recent run?</w:t>
-      </w:r>
-    </w:p>
-    <w:p>
-      <w:pPr>
-        <w:pStyle w:val="Heading1"/>
-      </w:pPr>
-      <w:r>
-        <w:t>8. Example Outcomes</w:t>
+        <w:t xml:space="preserve">• `manual`: the control is a non-policy/process action outside the supported deployment path;</w:t>
       </w:r>
     </w:p>
     <w:p>
       <w:r>
-        <w:rPr>
-          <w:b/>
-        </w:rPr>
-        <w:t xml:space="preserve">Confident mapping: </w:t>
+        <w:t xml:space="preserve">• `not-applicable`: the recommendation is excluded by a documented applicability rule.</w:t>
       </w:r>
+    </w:p>
+    <w:p/>
+    <w:p>
       <w:r>
-        <w:t>The benchmark specifies an Intune Settings Catalog path and value. The current tenant exposes one matching definition and the required choice is valid. Result: mapped and deployable.</w:t>
+        <w:t xml:space="preserve">These fields must not be inferred from each other. In particular, a CIS `Manual` recommendation may be `mapped` when a deterministic Intune implementation exists.</w:t>
+      </w:r>
+    </w:p>
+    <w:p/>
+    <w:p>
+      <w:r>
+        <w:t xml:space="preserve">Only final `mapped` recommendations are deployable. When an administrator supplies a required decision, the compiler validates the value against the catalog's reviewed constraints and emits a final `mapped` record with `catalogMappingStatus: requires-input` and `decisionRef` provenance. Without that input, the record remains `requires-input` and its deployable object is omitted.</w:t>
+      </w:r>
+    </w:p>
+    <w:p/>
+    <w:p>
+      <w:pPr>
+        <w:pStyle w:val="Heading2"/>
+      </w:pPr>
+      <w:r>
+        <w:t xml:space="preserve">Non-negotiable rules</w:t>
+      </w:r>
+    </w:p>
+    <w:p/>
+    <w:p>
+      <w:r>
+        <w:t xml:space="preserve">• Never construct, derive, or guess a `settingDefinitionId`.</w:t>
       </w:r>
     </w:p>
     <w:p>
       <w:r>
-        <w:rPr>
-          <w:b/>
-        </w:rPr>
-        <w:t xml:space="preserve">Ambiguous setting: </w:t>
-      </w:r>
-      <w:r>
-        <w:t>Two current Settings Catalog definitions appear to match the benchmark wording and there is no authoritative discriminator. Result: unresolved; no policy setting is generated.</w:t>
+        <w:t xml:space="preserve">• Resolve a setting only by an explicit reviewed ID or an exact `baseUri + offsetUri` tuple that matches exactly one definition.</w:t>
       </w:r>
     </w:p>
     <w:p>
       <w:r>
-        <w:rPr>
-          <w:b/>
-        </w:rPr>
-        <w:t xml:space="preserve">Manual CIS control: </w:t>
-      </w:r>
-      <w:r>
-        <w:t>The benchmark instructs the administrator to configure a tenant-wide setting that is not exposed by the supported API path. Result: manual; action is documented, not automated.</w:t>
+        <w:t xml:space="preserve">• Never use a display-name fallback to make a deployment decision.</w:t>
       </w:r>
     </w:p>
     <w:p>
       <w:r>
-        <w:rPr>
-          <w:b/>
-        </w:rPr>
-        <w:t xml:space="preserve">API drift: </w:t>
-      </w:r>
-      <w:r>
-        <w:t>A previously valid setting ID is no longer exposed in the target tenant. Result: unresolved until the current Microsoft representation is identified and reviewed.</w:t>
-      </w:r>
-    </w:p>
-    <w:p>
-      <w:pPr>
-        <w:pStyle w:val="Heading1"/>
-      </w:pPr>
-      <w:r>
-        <w:t>9. Definition of Done for a Benchmark Pack</w:t>
-      </w:r>
-    </w:p>
-    <w:p>
-      <w:pPr>
-        <w:pStyle w:val="ListBullet"/>
-      </w:pPr>
-      <w:r>
-        <w:t>Every in-scope recommendation has an explicit state.</w:t>
-      </w:r>
-    </w:p>
-    <w:p>
-      <w:pPr>
-        <w:pStyle w:val="ListBullet"/>
-      </w:pPr>
-      <w:r>
-        <w:t>No unresolved or manual recommendation is silently included in a deployable payload.</w:t>
-      </w:r>
-    </w:p>
-    <w:p>
-      <w:pPr>
-        <w:pStyle w:val="ListBullet"/>
-      </w:pPr>
-      <w:r>
-        <w:t>All generated JSON payloads pass structural validation.</w:t>
-      </w:r>
-    </w:p>
-    <w:p>
-      <w:pPr>
-        <w:pStyle w:val="ListBullet"/>
-      </w:pPr>
-      <w:r>
-        <w:t>All dynamically resolved Intune settings resolve successfully in DryRun for the selected profile.</w:t>
-      </w:r>
-    </w:p>
-    <w:p>
-      <w:pPr>
-        <w:pStyle w:val="ListBullet"/>
-      </w:pPr>
-      <w:r>
-        <w:t>Graph write probes pass before bulk creation is attempted.</w:t>
-      </w:r>
-    </w:p>
-    <w:p>
-      <w:pPr>
-        <w:pStyle w:val="ListBullet"/>
-      </w:pPr>
-      <w:r>
-        <w:t>Created policies are unassigned by default.</w:t>
-      </w:r>
-    </w:p>
-    <w:p>
-      <w:pPr>
-        <w:pStyle w:val="ListBullet"/>
-      </w:pPr>
-      <w:r>
-        <w:t>The pack includes a machine-readable mapping report and a human-readable validation summary.</w:t>
-      </w:r>
-    </w:p>
-    <w:p>
-      <w:pPr>
-        <w:pStyle w:val="ListBullet"/>
-      </w:pPr>
-      <w:r>
-        <w:t>Any benchmark-specific deviations, exclusions, or interpretation decisions are documented.</w:t>
-      </w:r>
-    </w:p>
-    <w:p>
-      <w:pPr>
-        <w:pStyle w:val="Heading1"/>
-      </w:pPr>
-      <w:r>
-        <w:t>10. Public Repository Guidance</w:t>
+        <w:t xml:space="preserve">• Never guess or heuristically select a choice/value ID.</w:t>
       </w:r>
     </w:p>
     <w:p>
       <w:r>
-        <w:t>The public CISPolicyCreator repository should contain original tooling, schemas, mapping metadata, policy generation logic, and documentation. CIS benchmark PDFs should not be committed to the public repository. The tool should expect users to supply legitimately obtained benchmark documents locally when extraction or mapping is required.</w:t>
-      </w:r>
-    </w:p>
-    <w:p>
-      <w:pPr>
-        <w:pStyle w:val="Heading1"/>
-      </w:pPr>
-      <w:r>
-        <w:t>11. Project Principle</w:t>
+        <w:t xml:space="preserve">• Choice settings require an exact reviewed `optionId` present exactly once in the pinned and live definition.</w:t>
       </w:r>
     </w:p>
     <w:p>
       <w:r>
-        <w:rPr>
-          <w:b/>
-        </w:rPr>
-        <w:t xml:space="preserve">When in doubt, do not deploy. </w:t>
+        <w:t xml:space="preserve">• Ambiguous or missing definition/value matches fail closed.</w:t>
       </w:r>
+    </w:p>
+    <w:p>
       <w:r>
-        <w:t>CISPolicyCreator must prefer an explicit unresolved/manual result over a plausible but unverified Intune configuration.</w:t>
+        <w:t xml:space="preserve">• Static embedded Settings Catalog settings are rejected because they bypass definition/value validation.</w:t>
+      </w:r>
+    </w:p>
+    <w:p>
+      <w:r>
+        <w:t xml:space="preserve">• Organizational choices require an explicit acknowledged decision from the administrator.</w:t>
+      </w:r>
+    </w:p>
+    <w:p>
+      <w:r>
+        <w:t xml:space="preserve">• Non-policy and process controls remain `manual`.</w:t>
+      </w:r>
+    </w:p>
+    <w:p>
+      <w:r>
+        <w:t xml:space="preserve">• No assignment endpoints, assignment payloads, group creation, or automatic policy assignments are permitted.</w:t>
+      </w:r>
+    </w:p>
+    <w:p/>
+    <w:p>
+      <w:pPr>
+        <w:pStyle w:val="Heading2"/>
+      </w:pPr>
+      <w:r>
+        <w:t xml:space="preserve">Validation layers</w:t>
+      </w:r>
+    </w:p>
+    <w:p/>
+    <w:p>
+      <w:r>
+        <w:t xml:space="preserve">1. Verify benchmark identity and required document text declared by the reviewed catalog.</w:t>
+      </w:r>
+    </w:p>
+    <w:p>
+      <w:r>
+        <w:t xml:space="preserve">2. Extract recommendation ID, profile, assessment method, and private review text locally.</w:t>
+      </w:r>
+    </w:p>
+    <w:p>
+      <w:r>
+        <w:t xml:space="preserve">3. Reject empty extraction, duplicate IDs, unknown profiles, or assessment-method mismatches.</w:t>
+      </w:r>
+    </w:p>
+    <w:p>
+      <w:r>
+        <w:t xml:space="preserve">4. Require the exact expected recommendation count and an explicit catalog classification for every extracted ID; incomplete catalogs fail.</w:t>
+      </w:r>
+    </w:p>
+    <w:p>
+      <w:r>
+        <w:t xml:space="preserve">5. Validate explicit administrator decisions against type/range/allowed-value constraints.</w:t>
+      </w:r>
+    </w:p>
+    <w:p>
+      <w:r>
+        <w:t xml:space="preserve">6. Resolve each Settings Catalog mapping against a pinned definition snapshot.</w:t>
+      </w:r>
+    </w:p>
+    <w:p>
+      <w:r>
+        <w:t xml:space="preserve">7. Generate deterministic pack files and provenance hashes.</w:t>
+      </w:r>
+    </w:p>
+    <w:p>
+      <w:r>
+        <w:t xml:space="preserve">8. Evaluate JSON Schemas and semantic cross-file rules.</w:t>
+      </w:r>
+    </w:p>
+    <w:p>
+      <w:r>
+        <w:t xml:space="preserve">9. During live dry run, validate the exact current Graph definition and option before any create request.</w:t>
+      </w:r>
+    </w:p>
+    <w:p>
+      <w:r>
+        <w:t xml:space="preserve">10. Create policies unassigned only after all selected mappings and payloads pass preflight.</w:t>
+      </w:r>
+    </w:p>
+    <w:p/>
+    <w:p>
+      <w:pPr>
+        <w:pStyle w:val="Heading2"/>
+      </w:pPr>
+      <w:r>
+        <w:t xml:space="preserve">Reproducibility and audit</w:t>
+      </w:r>
+    </w:p>
+    <w:p/>
+    <w:p>
+      <w:r>
+        <w:t xml:space="preserve">The generated manifest records the source PDF name/hash/page count, compiler/extractor/PDF-parser versions, mapping catalog identity/hash, decision-file hash, and Settings Catalog snapshot hash. Pack JSON uses stable ordering and contains no build timestamp. Identical input bytes produce identical generated pack bytes.</w:t>
+      </w:r>
+    </w:p>
+    <w:p/>
+    <w:p>
+      <w:r>
+        <w:t xml:space="preserve">Every recommendation remains visible in the inventory, including unresolved, requires-input, manual, and not-applicable items. A reviewer can trace every deployable object back to recommendation IDs, profiles, assessment method, mapping status, implementation references, exact Graph definition/value, and administrator decision where applicable.</w:t>
+      </w:r>
+    </w:p>
+    <w:p/>
+    <w:p>
+      <w:pPr>
+        <w:pStyle w:val="Heading2"/>
+      </w:pPr>
+      <w:r>
+        <w:t xml:space="preserve">Runtime controls</w:t>
+      </w:r>
+    </w:p>
+    <w:p/>
+    <w:p>
+      <w:r>
+        <w:t xml:space="preserve">• Offline validation happens before authentication.</w:t>
+      </w:r>
+    </w:p>
+    <w:p>
+      <w:r>
+        <w:t xml:space="preserve">• Dry run requests read-only Graph scope.</w:t>
+      </w:r>
+    </w:p>
+    <w:p>
+      <w:r>
+        <w:t xml:space="preserve">• Tenant ID can be pinned explicitly.</w:t>
+      </w:r>
+    </w:p>
+    <w:p>
+      <w:r>
+        <w:t xml:space="preserve">• Existing exact-name objects are skipped and never patched.</w:t>
+      </w:r>
+    </w:p>
+    <w:p>
+      <w:r>
+        <w:t xml:space="preserve">• The write probe is temporary, unassigned, and cleanup is attempted in `finally`.</w:t>
+      </w:r>
+    </w:p>
+    <w:p>
+      <w:r>
+        <w:t xml:space="preserve">• Creation stops on the first Graph error by default.</w:t>
+      </w:r>
+    </w:p>
+    <w:p>
+      <w:r>
+        <w:t xml:space="preserve">• Partial/preflight results are preserved when possible.</w:t>
+      </w:r>
+    </w:p>
+    <w:p>
+      <w:r>
+        <w:t xml:space="preserve">• Import never creates assignments.</w:t>
+      </w:r>
+    </w:p>
+    <w:p/>
+    <w:p>
+      <w:pPr>
+        <w:pStyle w:val="Heading2"/>
+      </w:pPr>
+      <w:r>
+        <w:t xml:space="preserve">Definition of done</w:t>
+      </w:r>
+    </w:p>
+    <w:p/>
+    <w:p>
+      <w:r>
+        <w:t xml:space="preserve">A benchmark catalog is complete only when every extracted recommendation has an explicit final state, all mapped objects have exact reviewed evidence, all administrator decisions are explicit, repeated builds are byte-identical, offline tests pass, live dry run resolves every selected mapping, test-tenant behavior is validated, and all policies remain unassigned by default.</w:t>
       </w:r>
     </w:p>
     <w:sectPr>
-      <w:footerReference w:type="default" r:id="rId9"/>
       <w:pgSz w:w="12240" w:h="15840"/>
-      <w:pgMar w:top="936" w:right="1080" w:bottom="936" w:left="1080" w:header="720" w:footer="720" w:gutter="0"/>
-      <w:cols w:space="720"/>
-      <w:docGrid w:linePitch="360"/>
+      <w:pgMar w:top="1440" w:right="1440" w:bottom="1440" w:left="1440"/>
     </w:sectPr>
   </w:body>
 </w:document>

</xml_diff>